<commit_message>
Added function for distribution testing
</commit_message>
<xml_diff>
--- a/LLM Output Insights.docx
+++ b/LLM Output Insights.docx
@@ -134,23 +134,7 @@
           <w:b/>
           <w:bCs/>
         </w:rPr>
-        <w:t xml:space="preserve">- Does the GDP differ among regions A, B, and C by a statistically significant amount </w:t>
-      </w:r>
-      <w:proofErr w:type="spellStart"/>
-      <w:r>
-        <w:rPr>
-          <w:b/>
-          <w:bCs/>
-        </w:rPr>
-        <w:t>over all</w:t>
-      </w:r>
-      <w:proofErr w:type="spellEnd"/>
-      <w:r>
-        <w:rPr>
-          <w:b/>
-          <w:bCs/>
-        </w:rPr>
-        <w:t xml:space="preserve"> years?</w:t>
+        <w:t>- Does the GDP differ among regions A, B, and C by a statistically significant amount over all years?</w:t>
       </w:r>
     </w:p>
     <w:p>
@@ -228,35 +212,19 @@
         </w:numPr>
       </w:pPr>
       <w:r>
-        <w:t xml:space="preserve">Uses Shapiro-Wilk, which generalizes </w:t>
-      </w:r>
-      <w:proofErr w:type="gramStart"/>
-      <w:r>
-        <w:t>pretty well</w:t>
-      </w:r>
-      <w:proofErr w:type="gramEnd"/>
-      <w:r>
-        <w:t xml:space="preserve"> to larger number of data points</w:t>
-      </w:r>
-    </w:p>
-    <w:p>
-      <w:pPr>
-        <w:pStyle w:val="ListParagraph"/>
-        <w:numPr>
-          <w:ilvl w:val="0"/>
-          <w:numId w:val="1"/>
-        </w:numPr>
-      </w:pPr>
-      <w:r>
-        <w:t xml:space="preserve">Uses parametric tests rather than non-parametric tests; however, GDP does not follow a normal distribution as per our analysis. Tests seem to generalize pretty well as there are a large number of data </w:t>
-      </w:r>
-      <w:proofErr w:type="gramStart"/>
-      <w:r>
-        <w:t>points</w:t>
-      </w:r>
-      <w:proofErr w:type="gramEnd"/>
-      <w:r>
-        <w:t xml:space="preserve"> but it would be interesting to see cases where a non-parametric test is needed and results might differ</w:t>
+        <w:t>Uses Shapiro-Wilk, which generalizes pretty well to larger number of data points</w:t>
+      </w:r>
+    </w:p>
+    <w:p>
+      <w:pPr>
+        <w:pStyle w:val="ListParagraph"/>
+        <w:numPr>
+          <w:ilvl w:val="0"/>
+          <w:numId w:val="1"/>
+        </w:numPr>
+      </w:pPr>
+      <w:r>
+        <w:t>Uses parametric tests rather than non-parametric tests; however, GDP does not follow a normal distribution as per our analysis. Tests seem to generalize pretty well as there are a large number of data points but it would be interesting to see cases where a non-parametric test is needed and results might differ</w:t>
       </w:r>
     </w:p>
     <w:p>
@@ -280,15 +248,7 @@
         </w:numPr>
       </w:pPr>
       <w:r>
-        <w:t xml:space="preserve">Multivariable linear regression does not seem to produce accurate results – Julius prints out all variables but only 2 </w:t>
-      </w:r>
-      <w:proofErr w:type="gramStart"/>
-      <w:r>
-        <w:t>actually have</w:t>
-      </w:r>
-      <w:proofErr w:type="gramEnd"/>
-      <w:r>
-        <w:t xml:space="preserve"> statistically significant p-values and are significant predictors</w:t>
+        <w:t>Multivariable linear regression does not seem to produce accurate results – Julius prints out all variables but only 2 actually have statistically significant p-values and are significant predictors</w:t>
       </w:r>
     </w:p>
     <w:p>
@@ -374,15 +334,7 @@
         </w:numPr>
       </w:pPr>
       <w:r>
-        <w:t xml:space="preserve">Initially runs independent t-test rather than paired on data from same country, later does </w:t>
-      </w:r>
-      <w:proofErr w:type="gramStart"/>
-      <w:r>
-        <w:t>a  paired</w:t>
-      </w:r>
-      <w:proofErr w:type="gramEnd"/>
-      <w:r>
-        <w:t xml:space="preserve"> test</w:t>
+        <w:t>Initially runs independent t-test rather than paired on data from same country, later does a  paired test</w:t>
       </w:r>
     </w:p>
     <w:p>
@@ -438,15 +390,7 @@
         </w:numPr>
       </w:pPr>
       <w:r>
-        <w:t xml:space="preserve">Unable to run code to analyze my data within the platform – can only provide written summaries or code that I </w:t>
-      </w:r>
-      <w:proofErr w:type="gramStart"/>
-      <w:r>
-        <w:t>have to</w:t>
-      </w:r>
-      <w:proofErr w:type="gramEnd"/>
-      <w:r>
-        <w:t xml:space="preserve"> run myself</w:t>
+        <w:t>Unable to run code to analyze my data within the platform – can only provide written summaries or code that I have to run myself</w:t>
       </w:r>
     </w:p>
     <w:p>
@@ -702,15 +646,7 @@
         </w:numPr>
       </w:pPr>
       <w:r>
-        <w:t xml:space="preserve">Did not scale the data before running linear regression – chooses to run </w:t>
-      </w:r>
-      <w:proofErr w:type="spellStart"/>
-      <w:r>
-        <w:t>StandardScaler</w:t>
-      </w:r>
-      <w:proofErr w:type="spellEnd"/>
-      <w:r>
-        <w:t xml:space="preserve"> rather than min-max scaling</w:t>
+        <w:t>Did not scale the data before running linear regression – chooses to run StandardScaler rather than min-max scaling</w:t>
       </w:r>
     </w:p>
     <w:p>
@@ -732,32 +668,19 @@
         </w:numPr>
       </w:pPr>
       <w:r>
-        <w:t xml:space="preserve">Datasets can get confusing to look </w:t>
-      </w:r>
-      <w:proofErr w:type="gramStart"/>
-      <w:r>
-        <w:t>at</w:t>
-      </w:r>
-      <w:proofErr w:type="gramEnd"/>
-      <w:r>
-        <w:t xml:space="preserve"> but the correlation analysis seems to be correct</w:t>
-      </w:r>
-    </w:p>
-    <w:p>
-      <w:pPr>
-        <w:pStyle w:val="ListParagraph"/>
-        <w:numPr>
-          <w:ilvl w:val="0"/>
-          <w:numId w:val="1"/>
-        </w:numPr>
-      </w:pPr>
-      <w:proofErr w:type="spellStart"/>
-      <w:r>
-        <w:t>Normaltest</w:t>
-      </w:r>
-      <w:proofErr w:type="spellEnd"/>
-      <w:r>
-        <w:t xml:space="preserve"> is used when normality testing which is not best practice</w:t>
+        <w:t>Datasets can get confusing to look at but the correlation analysis seems to be correct</w:t>
+      </w:r>
+    </w:p>
+    <w:p>
+      <w:pPr>
+        <w:pStyle w:val="ListParagraph"/>
+        <w:numPr>
+          <w:ilvl w:val="0"/>
+          <w:numId w:val="1"/>
+        </w:numPr>
+      </w:pPr>
+      <w:r>
+        <w:t>Normaltest is used when normality testing which is not best practice</w:t>
       </w:r>
     </w:p>
     <w:p>
@@ -1083,15 +1006,7 @@
         </w:numPr>
       </w:pPr>
       <w:r>
-        <w:t xml:space="preserve">Copilot in Excel is very </w:t>
-      </w:r>
-      <w:proofErr w:type="spellStart"/>
-      <w:r>
-        <w:t>very</w:t>
-      </w:r>
-      <w:proofErr w:type="spellEnd"/>
-      <w:r>
-        <w:t xml:space="preserve"> slow</w:t>
+        <w:t>Copilot in Excel is very very slow</w:t>
       </w:r>
     </w:p>
     <w:p>
@@ -1114,6 +1029,206 @@
           <w:bCs/>
         </w:rPr>
       </w:pPr>
+      <w:r>
+        <w:rPr>
+          <w:b/>
+          <w:bCs/>
+        </w:rPr>
+        <w:t xml:space="preserve">- Predict a country’s GDP 5 years into the future. </w:t>
+      </w:r>
+    </w:p>
+    <w:p>
+      <w:pPr>
+        <w:rPr>
+          <w:b/>
+          <w:bCs/>
+        </w:rPr>
+      </w:pPr>
+      <w:r>
+        <w:rPr>
+          <w:b/>
+          <w:bCs/>
+        </w:rPr>
+        <w:t>- Suppose we were to cluster these countries. What variables would define each cluster</w:t>
+      </w:r>
+      <w:r>
+        <w:rPr>
+          <w:b/>
+          <w:bCs/>
+        </w:rPr>
+        <w:t>?</w:t>
+      </w:r>
+    </w:p>
+    <w:p>
+      <w:pPr>
+        <w:rPr>
+          <w:b/>
+          <w:bCs/>
+        </w:rPr>
+      </w:pPr>
+      <w:r>
+        <w:rPr>
+          <w:b/>
+          <w:bCs/>
+        </w:rPr>
+        <w:t>- What countries are anomalies?</w:t>
+      </w:r>
+    </w:p>
+    <w:p>
+      <w:pPr>
+        <w:rPr>
+          <w:b/>
+          <w:bCs/>
+        </w:rPr>
+      </w:pPr>
+      <w:r>
+        <w:rPr>
+          <w:b/>
+          <w:bCs/>
+        </w:rPr>
+        <w:t xml:space="preserve">- Perform time series analysis on GDP data. What trends do we see? </w:t>
+      </w:r>
+    </w:p>
+    <w:p>
+      <w:pPr>
+        <w:rPr>
+          <w:b/>
+          <w:bCs/>
+        </w:rPr>
+      </w:pPr>
+      <w:r>
+        <w:rPr>
+          <w:b/>
+          <w:bCs/>
+        </w:rPr>
+        <w:t>- Suppose a country wants to improve its GDP. What should it focus on?</w:t>
+      </w:r>
+    </w:p>
+    <w:p>
+      <w:pPr>
+        <w:rPr>
+          <w:b/>
+          <w:bCs/>
+        </w:rPr>
+      </w:pPr>
+      <w:r>
+        <w:rPr>
+          <w:b/>
+          <w:bCs/>
+        </w:rPr>
+        <w:t>- Suppose we modify the variables of country A. How would its expected GDP change? How about its expected GDP 5 years into the future?</w:t>
+      </w:r>
+    </w:p>
+    <w:p>
+      <w:pPr>
+        <w:rPr>
+          <w:b/>
+          <w:bCs/>
+        </w:rPr>
+      </w:pPr>
+      <w:r>
+        <w:rPr>
+          <w:b/>
+          <w:bCs/>
+        </w:rPr>
+        <w:t>- What is interesting about this variable? What is interesting about this dataset?</w:t>
+      </w:r>
+    </w:p>
+    <w:p/>
+    <w:p>
+      <w:pPr>
+        <w:rPr>
+          <w:i/>
+          <w:iCs/>
+        </w:rPr>
+      </w:pPr>
+      <w:r>
+        <w:rPr>
+          <w:i/>
+          <w:iCs/>
+        </w:rPr>
+        <w:t>To do:</w:t>
+      </w:r>
+    </w:p>
+    <w:p>
+      <w:pPr>
+        <w:pStyle w:val="ListParagraph"/>
+        <w:numPr>
+          <w:ilvl w:val="0"/>
+          <w:numId w:val="1"/>
+        </w:numPr>
+        <w:rPr>
+          <w:i/>
+          <w:iCs/>
+        </w:rPr>
+      </w:pPr>
+      <w:r>
+        <w:rPr>
+          <w:i/>
+          <w:iCs/>
+        </w:rPr>
+        <w:t>Categorical data, chi-squared tests</w:t>
+      </w:r>
+    </w:p>
+    <w:p>
+      <w:pPr>
+        <w:pStyle w:val="ListParagraph"/>
+        <w:numPr>
+          <w:ilvl w:val="0"/>
+          <w:numId w:val="1"/>
+        </w:numPr>
+        <w:rPr>
+          <w:i/>
+          <w:iCs/>
+        </w:rPr>
+      </w:pPr>
+      <w:r>
+        <w:rPr>
+          <w:i/>
+          <w:iCs/>
+        </w:rPr>
+        <w:t>Time series analysis</w:t>
+      </w:r>
+    </w:p>
+    <w:p>
+      <w:pPr>
+        <w:pStyle w:val="ListParagraph"/>
+        <w:numPr>
+          <w:ilvl w:val="0"/>
+          <w:numId w:val="1"/>
+        </w:numPr>
+        <w:rPr>
+          <w:i/>
+          <w:iCs/>
+        </w:rPr>
+      </w:pPr>
+      <w:r>
+        <w:rPr>
+          <w:i/>
+          <w:iCs/>
+        </w:rPr>
+        <w:t>Descriptive statistics w/ count data</w:t>
+      </w:r>
+    </w:p>
+    <w:p>
+      <w:pPr>
+        <w:pStyle w:val="ListParagraph"/>
+        <w:numPr>
+          <w:ilvl w:val="0"/>
+          <w:numId w:val="1"/>
+        </w:numPr>
+        <w:rPr>
+          <w:i/>
+          <w:iCs/>
+        </w:rPr>
+      </w:pPr>
+      <w:r>
+        <w:rPr>
+          <w:i/>
+          <w:iCs/>
+        </w:rPr>
+        <w:t>Databricks analysis</w:t>
+      </w:r>
     </w:p>
     <w:sectPr>
       <w:pgSz w:w="12240" w:h="15840"/>

</xml_diff>